<commit_message>
Update author name and contact emails
</commit_message>
<xml_diff>
--- a/SyncField_Scientific_Paper.docx
+++ b/SyncField_Scientific_Paper.docx
@@ -35,7 +35,7 @@
           <w:rtl w:val="0"/>
           <w:lang w:val="en-US" w:eastAsia="en-US" w:bidi="en-US"/>
         </w:rPr>
-        <w:t>Mohamed Tariq Abdel Farraj · Mohammed Sharif · Ghaidaa Al-Sir · Dua al-Mahdi</w:t>
+        <w:t>Mohamed Tariq Abdel Farraj · Mohammed Sharif Ibrahim · Ghaidaa Al-Sir · Dua al-Mahdi</w:t>
       </w:r>
     </w:p>
     <w:p>
@@ -71,7 +71,7 @@
           <w:rtl w:val="0"/>
           <w:lang w:val="en-US" w:eastAsia="en-US" w:bidi="en-US"/>
         </w:rPr>
-        <w:t>Supervisor: Yahya Othman, MSc</w:t>
+        <w:t>Supervisor: Yahya Othman, MSc · yhyosman77@gmail.com</w:t>
       </w:r>
     </w:p>
     <w:p>
@@ -89,7 +89,7 @@
           <w:rtl w:val="0"/>
           <w:lang w:val="en-US" w:eastAsia="en-US" w:bidi="en-US"/>
         </w:rPr>
-        <w:t>Corresponding author: [email to be inserted before submission]</w:t>
+        <w:t>Corresponding author: targm87@gmail.com</w:t>
       </w:r>
     </w:p>
     <w:p>

</xml_diff>